<commit_message>
docs: track Framework_Handoff and the updated corrections notes
Framework_Handoff/ (8 files, 988K) - the package prepared for designing a
larger framework around this tool, extending to DC/DC, external simulator
integration and Altium output. Architecture PDF, two block diagrams, technical
brief, open items, current state, and 07_api_and_engines.json (63 endpoints /
18 engines / 38 graph nodes). It has sat untracked since the C201 era and is
described in SESSION_HANDOFF; untracked means a deletion is permanent.

specs/Improvments and Corrections.docx - the designer's running notes, updated.

Scanned before committing: no credentials, no email addresses, no personal
data in the text files or the JSON.

Co-Authored-By: Claude Opus 5 <noreply@anthropic.com>
Claude-Session: https://claude.ai/code/session_01T9RwQJ9BGdr3an36qHKXX7
</commit_message>
<xml_diff>
--- a/specs/Improvments and Corrections.docx
+++ b/specs/Improvments and Corrections.docx
@@ -3,21 +3,695 @@
 <w:document xmlns:wpc="http://schemas.microsoft.com/office/word/2010/wordprocessingCanvas" xmlns:cx="http://schemas.microsoft.com/office/drawing/2014/chartex" xmlns:cx1="http://schemas.microsoft.com/office/drawing/2015/9/8/chartex" xmlns:cx2="http://schemas.microsoft.com/office/drawing/2015/10/21/chartex" xmlns:cx3="http://schemas.microsoft.com/office/drawing/2016/5/9/chartex" xmlns:cx4="http://schemas.microsoft.com/office/drawing/2016/5/10/chartex" xmlns:cx5="http://schemas.microsoft.com/office/drawing/2016/5/11/chartex" xmlns:cx6="http://schemas.microsoft.com/office/drawing/2016/5/12/chartex" xmlns:cx7="http://schemas.microsoft.com/office/drawing/2016/5/13/chartex" xmlns:cx8="http://schemas.microsoft.com/office/drawing/2016/5/14/chartex" xmlns:mc="http://schemas.openxmlformats.org/markup-compatibility/2006" xmlns:aink="http://schemas.microsoft.com/office/drawing/2016/ink" xmlns:am3d="http://schemas.microsoft.com/office/drawing/2017/model3d" xmlns:o="urn:schemas-microsoft-com:office:office" xmlns:oel="http://schemas.microsoft.com/office/2019/extlst" xmlns:r="http://schemas.openxmlformats.org/officeDocument/2006/relationships" xmlns:m="http://schemas.openxmlformats.org/officeDocument/2006/math" xmlns:v="urn:schemas-microsoft-com:vml" xmlns:wp14="http://schemas.microsoft.com/office/word/2010/wordprocessingDrawing" xmlns:wp="http://schemas.openxmlformats.org/drawingml/2006/wordprocessingDrawing" xmlns:w10="urn:schemas-microsoft-com:office:word" xmlns:w="http://schemas.openxmlformats.org/wordprocessingml/2006/main" xmlns:w14="http://schemas.microsoft.com/office/word/2010/wordml" xmlns:w15="http://schemas.microsoft.com/office/word/2012/wordml" xmlns:w16cex="http://schemas.microsoft.com/office/word/2018/wordml/cex" xmlns:w16cid="http://schemas.microsoft.com/office/word/2016/wordml/cid" xmlns:w16="http://schemas.microsoft.com/office/word/2018/wordml" xmlns:w16du="http://schemas.microsoft.com/office/word/2023/wordml/word16du" xmlns:w16sdtdh="http://schemas.microsoft.com/office/word/2020/wordml/sdtdatahash" xmlns:w16sdtfl="http://schemas.microsoft.com/office/word/2024/wordml/sdtformatlock" xmlns:w16se="http://schemas.microsoft.com/office/word/2015/wordml/symex" xmlns:wpg="http://schemas.microsoft.com/office/word/2010/wordprocessingGroup" xmlns:wpi="http://schemas.microsoft.com/office/word/2010/wordprocessingInk" xmlns:wne="http://schemas.microsoft.com/office/word/2006/wordml" xmlns:wps="http://schemas.microsoft.com/office/word/2010/wordprocessingShape" mc:Ignorable="w14 w15 w16se w16cid w16 w16cex w16sdtdh w16sdtfl w16du wp14">
   <w:body>
     <w:p>
-      <w:r>
-        <w:t>On Control Design page below are the correction / Improvements needs to be performed.</w:t>
-      </w:r>
-    </w:p>
-    <w:p/>
-    <w:p>
       <w:pPr>
         <w:pStyle w:val="ListParagraph"/>
         <w:numPr>
           <w:ilvl w:val="0"/>
-          <w:numId w:val="13"/>
+          <w:numId w:val="14"/>
         </w:numPr>
-      </w:pPr>
-      <w:r>
-        <w:t xml:space="preserve">Screen 2 – Compensator &amp; Bode -&gt; </w:t>
+        <w:jc w:val="both"/>
+      </w:pPr>
+      <w:r>
+        <w:t xml:space="preserve">Control Design </w:t>
+      </w:r>
+      <w:r>
+        <w:t xml:space="preserve">-&gt; </w:t>
+      </w:r>
+      <w:r>
+        <w:rPr>
+          <w:b/>
+          <w:bCs/>
+        </w:rPr>
+        <w:t>Control Design · Screen 2 of 7 — Controller-Fixed Components &amp; Selections</w:t>
+      </w:r>
+      <w:r>
+        <w:rPr>
+          <w:b/>
+          <w:bCs/>
+        </w:rPr>
+        <w:t xml:space="preserve"> -&gt; Current sense resi</w:t>
+      </w:r>
+      <w:r>
+        <w:rPr>
+          <w:b/>
+          <w:bCs/>
+        </w:rPr>
+        <w:t xml:space="preserve">stor value selection from window -&gt; Looks like agent does calculate the </w:t>
+      </w:r>
+      <w:r>
+        <w:rPr>
+          <w:b/>
+          <w:bCs/>
+        </w:rPr>
+        <w:t>correct value but also shows 15 mOHM</w:t>
+      </w:r>
+      <w:r>
+        <w:rPr>
+          <w:b/>
+          <w:bCs/>
+        </w:rPr>
+        <w:t xml:space="preserve"> as one of the </w:t>
+      </w:r>
+      <w:r>
+        <w:rPr>
+          <w:b/>
+          <w:bCs/>
+        </w:rPr>
+        <w:t>suggestions</w:t>
+      </w:r>
+      <w:r>
+        <w:rPr>
+          <w:b/>
+          <w:bCs/>
+        </w:rPr>
+        <w:t>. Goal is to show mu</w:t>
+      </w:r>
+      <w:r>
+        <w:rPr>
+          <w:b/>
+          <w:bCs/>
+        </w:rPr>
+        <w:t xml:space="preserve">ltiple </w:t>
+      </w:r>
+      <w:r>
+        <w:rPr>
+          <w:b/>
+          <w:bCs/>
+        </w:rPr>
+        <w:t xml:space="preserve">standard </w:t>
+      </w:r>
+      <w:r>
+        <w:rPr>
+          <w:b/>
+          <w:bCs/>
+        </w:rPr>
+        <w:t xml:space="preserve">values for provided / calculated design specs based on the </w:t>
+      </w:r>
+      <w:r>
+        <w:rPr>
+          <w:b/>
+          <w:bCs/>
+        </w:rPr>
+        <w:t xml:space="preserve">calculation methods 1 and 2. </w:t>
+      </w:r>
+      <w:r>
+        <w:rPr>
+          <w:b/>
+          <w:bCs/>
+        </w:rPr>
+        <w:t xml:space="preserve">Find the reason and </w:t>
+      </w:r>
+      <w:r>
+        <w:rPr>
+          <w:b/>
+          <w:bCs/>
+        </w:rPr>
+        <w:t>correct it</w:t>
+      </w:r>
+      <w:r>
+        <w:rPr>
+          <w:b/>
+          <w:bCs/>
+        </w:rPr>
+        <w:t xml:space="preserve"> as well.</w:t>
+      </w:r>
+      <w:r>
+        <w:rPr>
+          <w:b/>
+          <w:bCs/>
+        </w:rPr>
+        <w:t xml:space="preserve"> Also during c</w:t>
+      </w:r>
+      <w:r>
+        <w:rPr>
+          <w:b/>
+          <w:bCs/>
+        </w:rPr>
+        <w:t>alculation, the value selected by designer on GUI page should be taken into account rather 15 mOHM.</w:t>
+      </w:r>
+    </w:p>
+    <w:p>
+      <w:pPr>
+        <w:pStyle w:val="ListParagraph"/>
+        <w:numPr>
+          <w:ilvl w:val="0"/>
+          <w:numId w:val="14"/>
+        </w:numPr>
+        <w:jc w:val="both"/>
+      </w:pPr>
+      <w:r>
+        <w:rPr>
+          <w:b/>
+          <w:bCs/>
+        </w:rPr>
+        <w:t xml:space="preserve">During the DC bus capacitor </w:t>
+      </w:r>
+      <w:r>
+        <w:rPr>
+          <w:b/>
+          <w:bCs/>
+        </w:rPr>
+        <w:t>simulation</w:t>
+      </w:r>
+      <w:r>
+        <w:rPr>
+          <w:b/>
+          <w:bCs/>
+        </w:rPr>
+        <w:t xml:space="preserve"> page -</w:t>
+      </w:r>
+      <w:r>
+        <w:rPr>
+          <w:b/>
+          <w:bCs/>
+        </w:rPr>
+        <w:t xml:space="preserve">&gt; Pk to PK ripple for 100% load </w:t>
+      </w:r>
+      <w:r>
+        <w:rPr>
+          <w:b/>
+          <w:bCs/>
+        </w:rPr>
+        <w:t xml:space="preserve">has value which is different </w:t>
+      </w:r>
+      <w:r>
+        <w:rPr>
+          <w:b/>
+          <w:bCs/>
+        </w:rPr>
+        <w:t>th</w:t>
+      </w:r>
+      <w:r>
+        <w:rPr>
+          <w:b/>
+          <w:bCs/>
+        </w:rPr>
+        <w:t>en control design page</w:t>
+      </w:r>
+      <w:r>
+        <w:rPr>
+          <w:b/>
+          <w:bCs/>
+        </w:rPr>
+        <w:t xml:space="preserve"> -&gt; 4b volta</w:t>
+      </w:r>
+      <w:r>
+        <w:rPr>
+          <w:b/>
+          <w:bCs/>
+        </w:rPr>
+        <w:t>g</w:t>
+      </w:r>
+      <w:r>
+        <w:rPr>
+          <w:b/>
+          <w:bCs/>
+        </w:rPr>
+        <w:t>e loop</w:t>
+      </w:r>
+      <w:r>
+        <w:rPr>
+          <w:b/>
+          <w:bCs/>
+        </w:rPr>
+        <w:t xml:space="preserve"> shows at Live step response – 0% to 100% </w:t>
+      </w:r>
+      <w:r>
+        <w:rPr>
+          <w:b/>
+          <w:bCs/>
+        </w:rPr>
+        <w:t xml:space="preserve">step load when Vout gets stabilize. </w:t>
+      </w:r>
+    </w:p>
+    <w:p>
+      <w:pPr>
+        <w:pStyle w:val="ListParagraph"/>
+        <w:numPr>
+          <w:ilvl w:val="0"/>
+          <w:numId w:val="14"/>
+        </w:numPr>
+        <w:jc w:val="both"/>
+      </w:pPr>
+      <w:r>
+        <w:rPr>
+          <w:b/>
+          <w:bCs/>
+        </w:rPr>
+        <w:t xml:space="preserve">Control </w:t>
+      </w:r>
+      <w:r>
+        <w:rPr>
+          <w:b/>
+          <w:bCs/>
+        </w:rPr>
+        <w:t>Loop Design -&gt; 4C Final components -&gt; There are two tables</w:t>
+      </w:r>
+      <w:r>
+        <w:rPr>
+          <w:b/>
+          <w:bCs/>
+        </w:rPr>
+        <w:t xml:space="preserve"> 1) Final Control loop components 2) Stability scorecard</w:t>
+      </w:r>
+      <w:r>
+        <w:rPr>
+          <w:b/>
+          <w:bCs/>
+        </w:rPr>
+        <w:t>. Both has up-down scroller. We have enough space to show entire table without scrolling up and down. Remove scroller from both table and show full length of tables.</w:t>
+      </w:r>
+    </w:p>
+    <w:p>
+      <w:pPr>
+        <w:pStyle w:val="ListParagraph"/>
+        <w:numPr>
+          <w:ilvl w:val="0"/>
+          <w:numId w:val="14"/>
+        </w:numPr>
+        <w:jc w:val="both"/>
+        <w:rPr>
+          <w:b/>
+          <w:bCs/>
+        </w:rPr>
+      </w:pPr>
+      <w:r>
+        <w:rPr>
+          <w:b/>
+          <w:bCs/>
+        </w:rPr>
+        <w:t xml:space="preserve">Control loop design -&gt; </w:t>
+      </w:r>
+      <w:r>
+        <w:rPr>
+          <w:b/>
+          <w:bCs/>
+        </w:rPr>
+        <w:t>Application Schematic </w:t>
+      </w:r>
+      <w:r>
+        <w:rPr>
+          <w:b/>
+          <w:bCs/>
+        </w:rPr>
+        <w:t>-&gt;</w:t>
+      </w:r>
+    </w:p>
+    <w:p>
+      <w:pPr>
+        <w:pStyle w:val="ListParagraph"/>
+        <w:numPr>
+          <w:ilvl w:val="0"/>
+          <w:numId w:val="15"/>
+        </w:numPr>
+        <w:jc w:val="both"/>
+        <w:rPr>
+          <w:b/>
+          <w:bCs/>
+        </w:rPr>
+      </w:pPr>
+      <w:r>
+        <w:rPr>
+          <w:b/>
+          <w:bCs/>
+        </w:rPr>
+        <w:t xml:space="preserve"> Remove messages</w:t>
+      </w:r>
+      <w:r>
+        <w:rPr>
+          <w:b/>
+          <w:bCs/>
+        </w:rPr>
+        <w:t xml:space="preserve"> -&gt; </w:t>
+      </w:r>
+      <w:r>
+        <w:t>Topology per the FLEX2 front-end reference (sheet 2). </w:t>
+      </w:r>
+      <w:r>
+        <w:rPr>
+          <w:b/>
+          <w:bCs/>
+        </w:rPr>
+        <w:t>Amber values</w:t>
+      </w:r>
+      <w:r>
+        <w:t> are taken live from your selections on Screens 1–2; grey "(typ)" parts are not sized by this tool.</w:t>
+      </w:r>
+    </w:p>
+    <w:p>
+      <w:pPr>
+        <w:pStyle w:val="ListParagraph"/>
+        <w:numPr>
+          <w:ilvl w:val="0"/>
+          <w:numId w:val="15"/>
+        </w:numPr>
+        <w:jc w:val="both"/>
+        <w:rPr>
+          <w:b/>
+          <w:bCs/>
+        </w:rPr>
+      </w:pPr>
+      <w:r>
+        <w:t xml:space="preserve">Change </w:t>
+      </w:r>
+      <w:r>
+        <w:t>-&gt; “</w:t>
+      </w:r>
+      <w:r>
+        <w:rPr>
+          <w:b/>
+          <w:bCs/>
+        </w:rPr>
+        <w:t>FAN9672 Pin Networks (live values)</w:t>
+      </w:r>
+      <w:r>
+        <w:rPr>
+          <w:b/>
+          <w:bCs/>
+        </w:rPr>
+        <w:t>” to “</w:t>
+      </w:r>
+      <w:r>
+        <w:rPr>
+          <w:b/>
+          <w:bCs/>
+        </w:rPr>
+        <w:t>FAN9672 Pin Networks</w:t>
+      </w:r>
+      <w:r>
+        <w:rPr>
+          <w:b/>
+          <w:bCs/>
+        </w:rPr>
+        <w:t>”</w:t>
+      </w:r>
+    </w:p>
+    <w:p>
+      <w:pPr>
+        <w:pStyle w:val="ListParagraph"/>
+        <w:numPr>
+          <w:ilvl w:val="0"/>
+          <w:numId w:val="15"/>
+        </w:numPr>
+        <w:jc w:val="both"/>
+        <w:rPr>
+          <w:b/>
+          <w:bCs/>
+        </w:rPr>
+      </w:pPr>
+      <w:r>
+        <w:rPr>
+          <w:b/>
+          <w:bCs/>
+        </w:rPr>
+        <w:t xml:space="preserve">Remove </w:t>
+      </w:r>
+      <w:r>
+        <w:rPr>
+          <w:b/>
+          <w:bCs/>
+        </w:rPr>
+        <w:t>-&gt;  “</w:t>
+      </w:r>
+      <w:r>
+        <w:rPr>
+          <w:b/>
+          <w:bCs/>
+        </w:rPr>
+        <w:t>Screen 7/7 · Schematic &amp; Report</w:t>
+      </w:r>
+      <w:r>
+        <w:rPr>
+          <w:b/>
+          <w:bCs/>
+        </w:rPr>
+        <w:t>”</w:t>
+      </w:r>
+    </w:p>
+    <w:p>
+      <w:pPr>
+        <w:pStyle w:val="ListParagraph"/>
+        <w:numPr>
+          <w:ilvl w:val="0"/>
+          <w:numId w:val="15"/>
+        </w:numPr>
+        <w:jc w:val="both"/>
+        <w:rPr>
+          <w:b/>
+          <w:bCs/>
+        </w:rPr>
+      </w:pPr>
+      <w:r>
+        <w:rPr>
+          <w:b/>
+          <w:bCs/>
+        </w:rPr>
+        <w:t xml:space="preserve">Change -&gt; </w:t>
+      </w:r>
+      <w:r>
+        <w:rPr>
+          <w:b/>
+          <w:bCs/>
+        </w:rPr>
+        <w:t>“Download + Review (chapter 1-6 +Appendices” to “</w:t>
+      </w:r>
+      <w:r>
+        <w:rPr>
+          <w:b/>
+          <w:bCs/>
+        </w:rPr>
+        <w:t>Download &amp; Review Report”</w:t>
+      </w:r>
+    </w:p>
+    <w:p>
+      <w:pPr>
+        <w:pStyle w:val="ListParagraph"/>
+        <w:numPr>
+          <w:ilvl w:val="0"/>
+          <w:numId w:val="14"/>
+        </w:numPr>
+        <w:jc w:val="both"/>
+        <w:rPr>
+          <w:b/>
+          <w:bCs/>
+        </w:rPr>
+      </w:pPr>
+      <w:r>
+        <w:rPr>
+          <w:b/>
+          <w:bCs/>
+        </w:rPr>
+        <w:t>Semiconductor page -&gt; Bridge</w:t>
+      </w:r>
+      <w:r>
+        <w:rPr>
+          <w:b/>
+          <w:bCs/>
+        </w:rPr>
+        <w:t xml:space="preserve"> -&gt; We already have </w:t>
+      </w:r>
+      <w:r>
+        <w:rPr>
+          <w:b/>
+          <w:bCs/>
+        </w:rPr>
+        <w:t xml:space="preserve">worst case input current calculated. Bridge tab shows the current </w:t>
+      </w:r>
+      <w:r>
+        <w:rPr>
+          <w:b/>
+          <w:bCs/>
+        </w:rPr>
+        <w:t xml:space="preserve">by default more than 15A on GUI. By </w:t>
+      </w:r>
+      <w:r>
+        <w:rPr>
+          <w:b/>
+          <w:bCs/>
+        </w:rPr>
+        <w:t>default,</w:t>
+      </w:r>
+      <w:r>
+        <w:rPr>
+          <w:b/>
+          <w:bCs/>
+        </w:rPr>
+        <w:t xml:space="preserve"> value shown should be greater than </w:t>
+      </w:r>
+      <w:r>
+        <w:rPr>
+          <w:b/>
+          <w:bCs/>
+        </w:rPr>
+        <w:t>already calculated worst case input current which designer can change.</w:t>
+      </w:r>
+      <w:r>
+        <w:rPr>
+          <w:b/>
+          <w:bCs/>
+        </w:rPr>
+        <w:t xml:space="preserve"> Samething for </w:t>
+      </w:r>
+      <w:r>
+        <w:rPr>
+          <w:b/>
+          <w:bCs/>
+        </w:rPr>
+        <w:t>sync_bottom, bypass bottom mosfets on bottom leges.</w:t>
+      </w:r>
+      <w:r>
+        <w:rPr>
+          <w:b/>
+          <w:bCs/>
+        </w:rPr>
+        <w:t xml:space="preserve"> And same for other semicondutors. </w:t>
+      </w:r>
+    </w:p>
+    <w:p>
+      <w:pPr>
+        <w:pStyle w:val="ListParagraph"/>
+        <w:numPr>
+          <w:ilvl w:val="0"/>
+          <w:numId w:val="14"/>
+        </w:numPr>
+        <w:jc w:val="both"/>
+        <w:rPr>
+          <w:b/>
+          <w:bCs/>
+        </w:rPr>
+      </w:pPr>
+      <w:r>
+        <w:rPr>
+          <w:b/>
+          <w:bCs/>
+        </w:rPr>
+        <w:t xml:space="preserve">If I select </w:t>
+      </w:r>
+      <w:r>
+        <w:rPr>
+          <w:b/>
+          <w:bCs/>
+        </w:rPr>
+        <w:t>higher number for device in parallel, I do not see any change in bridge rectifier drop. If current splits to half then diode drop per device will be less so we should see some change. Find the reason and fix it.</w:t>
+      </w:r>
+    </w:p>
+    <w:p>
+      <w:pPr>
+        <w:pStyle w:val="ListParagraph"/>
+        <w:numPr>
+          <w:ilvl w:val="0"/>
+          <w:numId w:val="14"/>
+        </w:numPr>
+        <w:jc w:val="both"/>
+        <w:rPr>
+          <w:b/>
+          <w:bCs/>
+        </w:rPr>
+      </w:pPr>
+      <w:r>
+        <w:rPr>
+          <w:b/>
+          <w:bCs/>
+        </w:rPr>
+        <w:t xml:space="preserve">Why </w:t>
+      </w:r>
+      <w:r>
+        <w:rPr>
+          <w:b/>
+          <w:bCs/>
+        </w:rPr>
+        <w:t>do I</w:t>
+      </w:r>
+      <w:r>
+        <w:rPr>
+          <w:b/>
+          <w:bCs/>
+        </w:rPr>
+        <w:t xml:space="preserve"> not see PFC diode switching losses</w:t>
+      </w:r>
+      <w:r>
+        <w:rPr>
+          <w:b/>
+          <w:bCs/>
+        </w:rPr>
+        <w:t xml:space="preserve"> and Reverse recovery losses</w:t>
+      </w:r>
+      <w:r>
+        <w:rPr>
+          <w:b/>
+          <w:bCs/>
+        </w:rPr>
+        <w:t xml:space="preserve">? Does agent calculate it? Find it and fix it. </w:t>
+      </w:r>
+    </w:p>
+    <w:p>
+      <w:pPr>
+        <w:pStyle w:val="ListParagraph"/>
+        <w:numPr>
+          <w:ilvl w:val="0"/>
+          <w:numId w:val="14"/>
+        </w:numPr>
+        <w:jc w:val="both"/>
+        <w:rPr>
+          <w:b/>
+          <w:bCs/>
+        </w:rPr>
+      </w:pPr>
+      <w:r>
+        <w:rPr>
+          <w:b/>
+          <w:bCs/>
+        </w:rPr>
+        <w:t xml:space="preserve">Input protection page -&gt; NTC inrush current limiter -&gt; </w:t>
+      </w:r>
+      <w:r>
+        <w:rPr>
+          <w:b/>
+          <w:bCs/>
+        </w:rPr>
+        <w:t xml:space="preserve"> Provide a designer to select correct NTC based on </w:t>
+      </w:r>
+      <w:r>
+        <w:rPr>
+          <w:b/>
+          <w:bCs/>
+        </w:rPr>
+        <w:t xml:space="preserve">calculation. RUpdate the calculation based on selected NTC and document in to report. </w:t>
+      </w:r>
+    </w:p>
+    <w:p>
+      <w:pPr>
+        <w:pStyle w:val="ListParagraph"/>
+        <w:numPr>
+          <w:ilvl w:val="0"/>
+          <w:numId w:val="14"/>
+        </w:numPr>
+        <w:jc w:val="both"/>
+        <w:rPr>
+          <w:b/>
+          <w:bCs/>
+        </w:rPr>
+      </w:pPr>
+      <w:r>
+        <w:rPr>
+          <w:b/>
+          <w:bCs/>
+        </w:rPr>
+        <w:t xml:space="preserve"> Input protecti</w:t>
+      </w:r>
+      <w:r>
+        <w:rPr>
+          <w:b/>
+          <w:bCs/>
+        </w:rPr>
+        <w:t xml:space="preserve">on -&gt; Only generate report for Chapter 8-9. Need to generate report full report including </w:t>
+      </w:r>
+      <w:r>
+        <w:rPr>
+          <w:b/>
+          <w:bCs/>
+        </w:rPr>
+        <w:t xml:space="preserve">previous steps. </w:t>
       </w:r>
     </w:p>
     <w:sectPr>
@@ -1067,6 +1741,95 @@
     </w:lvl>
   </w:abstractNum>
   <w:abstractNum w:abstractNumId="10" w15:restartNumberingAfterBreak="0">
+    <w:nsid w:val="45EA7340"/>
+    <w:multiLevelType w:val="hybridMultilevel"/>
+    <w:tmpl w:val="F5E28E68"/>
+    <w:lvl w:ilvl="0" w:tplc="6B74A8A2">
+      <w:start w:val="1"/>
+      <w:numFmt w:val="decimal"/>
+      <w:lvlText w:val="%1)"/>
+      <w:lvlJc w:val="left"/>
+      <w:pPr>
+        <w:ind w:left="411" w:hanging="360"/>
+      </w:pPr>
+      <w:rPr>
+        <w:rFonts w:hint="default"/>
+      </w:rPr>
+    </w:lvl>
+    <w:lvl w:ilvl="1" w:tplc="04090019" w:tentative="1">
+      <w:start w:val="1"/>
+      <w:numFmt w:val="lowerLetter"/>
+      <w:lvlText w:val="%2."/>
+      <w:lvlJc w:val="left"/>
+      <w:pPr>
+        <w:ind w:left="1131" w:hanging="360"/>
+      </w:pPr>
+    </w:lvl>
+    <w:lvl w:ilvl="2" w:tplc="0409001B" w:tentative="1">
+      <w:start w:val="1"/>
+      <w:numFmt w:val="lowerRoman"/>
+      <w:lvlText w:val="%3."/>
+      <w:lvlJc w:val="right"/>
+      <w:pPr>
+        <w:ind w:left="1851" w:hanging="180"/>
+      </w:pPr>
+    </w:lvl>
+    <w:lvl w:ilvl="3" w:tplc="0409000F" w:tentative="1">
+      <w:start w:val="1"/>
+      <w:numFmt w:val="decimal"/>
+      <w:lvlText w:val="%4."/>
+      <w:lvlJc w:val="left"/>
+      <w:pPr>
+        <w:ind w:left="2571" w:hanging="360"/>
+      </w:pPr>
+    </w:lvl>
+    <w:lvl w:ilvl="4" w:tplc="04090019" w:tentative="1">
+      <w:start w:val="1"/>
+      <w:numFmt w:val="lowerLetter"/>
+      <w:lvlText w:val="%5."/>
+      <w:lvlJc w:val="left"/>
+      <w:pPr>
+        <w:ind w:left="3291" w:hanging="360"/>
+      </w:pPr>
+    </w:lvl>
+    <w:lvl w:ilvl="5" w:tplc="0409001B" w:tentative="1">
+      <w:start w:val="1"/>
+      <w:numFmt w:val="lowerRoman"/>
+      <w:lvlText w:val="%6."/>
+      <w:lvlJc w:val="right"/>
+      <w:pPr>
+        <w:ind w:left="4011" w:hanging="180"/>
+      </w:pPr>
+    </w:lvl>
+    <w:lvl w:ilvl="6" w:tplc="0409000F" w:tentative="1">
+      <w:start w:val="1"/>
+      <w:numFmt w:val="decimal"/>
+      <w:lvlText w:val="%7."/>
+      <w:lvlJc w:val="left"/>
+      <w:pPr>
+        <w:ind w:left="4731" w:hanging="360"/>
+      </w:pPr>
+    </w:lvl>
+    <w:lvl w:ilvl="7" w:tplc="04090019" w:tentative="1">
+      <w:start w:val="1"/>
+      <w:numFmt w:val="lowerLetter"/>
+      <w:lvlText w:val="%8."/>
+      <w:lvlJc w:val="left"/>
+      <w:pPr>
+        <w:ind w:left="5451" w:hanging="360"/>
+      </w:pPr>
+    </w:lvl>
+    <w:lvl w:ilvl="8" w:tplc="0409001B" w:tentative="1">
+      <w:start w:val="1"/>
+      <w:numFmt w:val="lowerRoman"/>
+      <w:lvlText w:val="%9."/>
+      <w:lvlJc w:val="right"/>
+      <w:pPr>
+        <w:ind w:left="6171" w:hanging="180"/>
+      </w:pPr>
+    </w:lvl>
+  </w:abstractNum>
+  <w:abstractNum w:abstractNumId="11" w15:restartNumberingAfterBreak="0">
     <w:nsid w:val="4D5905B1"/>
     <w:multiLevelType w:val="hybridMultilevel"/>
     <w:tmpl w:val="F2CABAD6"/>
@@ -1179,7 +1942,7 @@
       </w:rPr>
     </w:lvl>
   </w:abstractNum>
-  <w:abstractNum w:abstractNumId="11" w15:restartNumberingAfterBreak="0">
+  <w:abstractNum w:abstractNumId="12" w15:restartNumberingAfterBreak="0">
     <w:nsid w:val="5A6356EB"/>
     <w:multiLevelType w:val="hybridMultilevel"/>
     <w:tmpl w:val="5584359A"/>
@@ -1292,7 +2055,96 @@
       </w:rPr>
     </w:lvl>
   </w:abstractNum>
-  <w:abstractNum w:abstractNumId="12" w15:restartNumberingAfterBreak="0">
+  <w:abstractNum w:abstractNumId="13" w15:restartNumberingAfterBreak="0">
+    <w:nsid w:val="72C005A2"/>
+    <w:multiLevelType w:val="hybridMultilevel"/>
+    <w:tmpl w:val="71FE9532"/>
+    <w:lvl w:ilvl="0" w:tplc="BE2C1FA6">
+      <w:start w:val="1"/>
+      <w:numFmt w:val="decimal"/>
+      <w:lvlText w:val="%1)"/>
+      <w:lvlJc w:val="left"/>
+      <w:pPr>
+        <w:ind w:left="771" w:hanging="360"/>
+      </w:pPr>
+      <w:rPr>
+        <w:rFonts w:hint="default"/>
+      </w:rPr>
+    </w:lvl>
+    <w:lvl w:ilvl="1" w:tplc="04090019" w:tentative="1">
+      <w:start w:val="1"/>
+      <w:numFmt w:val="lowerLetter"/>
+      <w:lvlText w:val="%2."/>
+      <w:lvlJc w:val="left"/>
+      <w:pPr>
+        <w:ind w:left="1491" w:hanging="360"/>
+      </w:pPr>
+    </w:lvl>
+    <w:lvl w:ilvl="2" w:tplc="0409001B" w:tentative="1">
+      <w:start w:val="1"/>
+      <w:numFmt w:val="lowerRoman"/>
+      <w:lvlText w:val="%3."/>
+      <w:lvlJc w:val="right"/>
+      <w:pPr>
+        <w:ind w:left="2211" w:hanging="180"/>
+      </w:pPr>
+    </w:lvl>
+    <w:lvl w:ilvl="3" w:tplc="0409000F" w:tentative="1">
+      <w:start w:val="1"/>
+      <w:numFmt w:val="decimal"/>
+      <w:lvlText w:val="%4."/>
+      <w:lvlJc w:val="left"/>
+      <w:pPr>
+        <w:ind w:left="2931" w:hanging="360"/>
+      </w:pPr>
+    </w:lvl>
+    <w:lvl w:ilvl="4" w:tplc="04090019" w:tentative="1">
+      <w:start w:val="1"/>
+      <w:numFmt w:val="lowerLetter"/>
+      <w:lvlText w:val="%5."/>
+      <w:lvlJc w:val="left"/>
+      <w:pPr>
+        <w:ind w:left="3651" w:hanging="360"/>
+      </w:pPr>
+    </w:lvl>
+    <w:lvl w:ilvl="5" w:tplc="0409001B" w:tentative="1">
+      <w:start w:val="1"/>
+      <w:numFmt w:val="lowerRoman"/>
+      <w:lvlText w:val="%6."/>
+      <w:lvlJc w:val="right"/>
+      <w:pPr>
+        <w:ind w:left="4371" w:hanging="180"/>
+      </w:pPr>
+    </w:lvl>
+    <w:lvl w:ilvl="6" w:tplc="0409000F" w:tentative="1">
+      <w:start w:val="1"/>
+      <w:numFmt w:val="decimal"/>
+      <w:lvlText w:val="%7."/>
+      <w:lvlJc w:val="left"/>
+      <w:pPr>
+        <w:ind w:left="5091" w:hanging="360"/>
+      </w:pPr>
+    </w:lvl>
+    <w:lvl w:ilvl="7" w:tplc="04090019" w:tentative="1">
+      <w:start w:val="1"/>
+      <w:numFmt w:val="lowerLetter"/>
+      <w:lvlText w:val="%8."/>
+      <w:lvlJc w:val="left"/>
+      <w:pPr>
+        <w:ind w:left="5811" w:hanging="360"/>
+      </w:pPr>
+    </w:lvl>
+    <w:lvl w:ilvl="8" w:tplc="0409001B" w:tentative="1">
+      <w:start w:val="1"/>
+      <w:numFmt w:val="lowerRoman"/>
+      <w:lvlText w:val="%9."/>
+      <w:lvlJc w:val="right"/>
+      <w:pPr>
+        <w:ind w:left="6531" w:hanging="180"/>
+      </w:pPr>
+    </w:lvl>
+  </w:abstractNum>
+  <w:abstractNum w:abstractNumId="14" w15:restartNumberingAfterBreak="0">
     <w:nsid w:val="7FC56C6D"/>
     <w:multiLevelType w:val="hybridMultilevel"/>
     <w:tmpl w:val="BE80ACD6"/>
@@ -1415,10 +2267,10 @@
     <w:abstractNumId w:val="2"/>
   </w:num>
   <w:num w:numId="4" w16cid:durableId="1292059308">
-    <w:abstractNumId w:val="12"/>
+    <w:abstractNumId w:val="14"/>
   </w:num>
   <w:num w:numId="5" w16cid:durableId="2046983878">
-    <w:abstractNumId w:val="10"/>
+    <w:abstractNumId w:val="11"/>
   </w:num>
   <w:num w:numId="6" w16cid:durableId="555162896">
     <w:abstractNumId w:val="3"/>
@@ -1436,13 +2288,19 @@
     <w:abstractNumId w:val="0"/>
   </w:num>
   <w:num w:numId="11" w16cid:durableId="1443308378">
-    <w:abstractNumId w:val="11"/>
+    <w:abstractNumId w:val="12"/>
   </w:num>
   <w:num w:numId="12" w16cid:durableId="465395555">
     <w:abstractNumId w:val="4"/>
   </w:num>
   <w:num w:numId="13" w16cid:durableId="316081061">
     <w:abstractNumId w:val="7"/>
+  </w:num>
+  <w:num w:numId="14" w16cid:durableId="1276789708">
+    <w:abstractNumId w:val="10"/>
+  </w:num>
+  <w:num w:numId="15" w16cid:durableId="1625580436">
+    <w:abstractNumId w:val="13"/>
   </w:num>
 </w:numbering>
 </file>

</xml_diff>